<commit_message>
Fix all icons, update resume
</commit_message>
<xml_diff>
--- a/public/Ayushi-Sinha-Resume.docx
+++ b/public/Ayushi-Sinha-Resume.docx
@@ -100,7 +100,7 @@
               </w:rPr>
               <w:t xml:space="preserve">  |  </w:t>
             </w:r>
-            <w:hyperlink w:history="1" r:id="rIdvpl-xbm3spg7jdebfg5xs">
+            <w:hyperlink w:history="1" r:id="rIde85wz5mvpzzwyvcaskwjq">
               <w:r>
                 <w:rPr>
                   <w:rFonts w:ascii="Calibri" w:cs="Calibri" w:eastAsia="Calibri" w:hAnsi="Calibri"/>
@@ -121,7 +121,7 @@
               </w:rPr>
               <w:t xml:space="preserve">  |  </w:t>
             </w:r>
-            <w:hyperlink w:history="1" r:id="rIdlaqjunzzk6fhbgu7cg0y3">
+            <w:hyperlink w:history="1" r:id="rIdzlpnpqkbb1ypwccal7uoa">
               <w:r>
                 <w:rPr>
                   <w:rFonts w:ascii="Calibri" w:cs="Calibri" w:eastAsia="Calibri" w:hAnsi="Calibri"/>
@@ -142,7 +142,7 @@
               </w:rPr>
               <w:t xml:space="preserve">  |  </w:t>
             </w:r>
-            <w:hyperlink w:history="1" r:id="rId666rmyr9thphj6qeeyr2r">
+            <w:hyperlink w:history="1" r:id="rIducjgi1kbd9pdhkij9wrwy">
               <w:r>
                 <w:rPr>
                   <w:rFonts w:ascii="Calibri" w:cs="Calibri" w:eastAsia="Calibri" w:hAnsi="Calibri"/>
@@ -1629,6 +1629,33 @@
         <w:t xml:space="preserve">  ·  LinkedIn Learning  ·  Dec 2024</w:t>
       </w:r>
     </w:p>
+    <w:p>
+      <w:pPr>
+        <w:spacing w:after="40" w:before="40"/>
+      </w:pPr>
+      <w:r>
+        <w:rPr>
+          <w:rFonts w:ascii="Calibri" w:cs="Calibri" w:eastAsia="Calibri" w:hAnsi="Calibri"/>
+          <w:b/>
+          <w:bCs/>
+          <w:color w:val="1A1A1A"/>
+          <w:sz w:val="18"/>
+          <w:szCs w:val="18"/>
+        </w:rPr>
+        <w:t xml:space="preserve">Leverage AI in Data Analytics: From Automation to Storytelling</w:t>
+      </w:r>
+      <w:r>
+        <w:rPr>
+          <w:rFonts w:ascii="Calibri" w:cs="Calibri" w:eastAsia="Calibri" w:hAnsi="Calibri"/>
+          <w:i/>
+          <w:iCs/>
+          <w:color w:val="6B7280"/>
+          <w:sz w:val="17"/>
+          <w:szCs w:val="17"/>
+        </w:rPr>
+        <w:t xml:space="preserve">  ·  LinkedIn Learning  ·  Sept 2026</w:t>
+      </w:r>
+    </w:p>
     <w:sectPr>
       <w:pgSz w:w="12240" w:h="15840" w:orient="portrait"/>
       <w:pgMar w:top="580" w:right="800" w:bottom="640" w:left="800" w:header="708" w:footer="708" w:gutter="0"/>

</xml_diff>

<commit_message>
Add certifications section, fix tab title, update resume with all certs, fix icons
</commit_message>
<xml_diff>
--- a/public/Ayushi-Sinha-Resume.docx
+++ b/public/Ayushi-Sinha-Resume.docx
@@ -100,7 +100,7 @@
               </w:rPr>
               <w:t xml:space="preserve">  |  </w:t>
             </w:r>
-            <w:hyperlink w:history="1" r:id="rIde85wz5mvpzzwyvcaskwjq">
+            <w:hyperlink w:history="1" r:id="rIdzh0xxdogmc3ofes-4etch">
               <w:r>
                 <w:rPr>
                   <w:rFonts w:ascii="Calibri" w:cs="Calibri" w:eastAsia="Calibri" w:hAnsi="Calibri"/>
@@ -121,7 +121,7 @@
               </w:rPr>
               <w:t xml:space="preserve">  |  </w:t>
             </w:r>
-            <w:hyperlink w:history="1" r:id="rIdzlpnpqkbb1ypwccal7uoa">
+            <w:hyperlink w:history="1" r:id="rIdgyhbvulfkizjxxnvlemvm">
               <w:r>
                 <w:rPr>
                   <w:rFonts w:ascii="Calibri" w:cs="Calibri" w:eastAsia="Calibri" w:hAnsi="Calibri"/>
@@ -142,7 +142,7 @@
               </w:rPr>
               <w:t xml:space="preserve">  |  </w:t>
             </w:r>
-            <w:hyperlink w:history="1" r:id="rIducjgi1kbd9pdhkij9wrwy">
+            <w:hyperlink w:history="1" r:id="rIdyhidbowjyj3uigfga0_qx">
               <w:r>
                 <w:rPr>
                   <w:rFonts w:ascii="Calibri" w:cs="Calibri" w:eastAsia="Calibri" w:hAnsi="Calibri"/>
@@ -1615,7 +1615,7 @@
           <w:sz w:val="18"/>
           <w:szCs w:val="18"/>
         </w:rPr>
-        <w:t xml:space="preserve">Learning Data Analytics: Foundations</w:t>
+        <w:t xml:space="preserve">SQL Essential Training</w:t>
       </w:r>
       <w:r>
         <w:rPr>
@@ -1626,7 +1626,7 @@
           <w:sz w:val="17"/>
           <w:szCs w:val="17"/>
         </w:rPr>
-        <w:t xml:space="preserve">  ·  LinkedIn Learning  ·  Dec 2024</w:t>
+        <w:t xml:space="preserve">  ·  NASBA  ·  Sep 2026</w:t>
       </w:r>
     </w:p>
     <w:p>
@@ -1642,7 +1642,7 @@
           <w:sz w:val="18"/>
           <w:szCs w:val="18"/>
         </w:rPr>
-        <w:t xml:space="preserve">Leverage AI in Data Analytics: From Automation to Storytelling</w:t>
+        <w:t xml:space="preserve">Build with AI: SQL AI Agents in Production</w:t>
       </w:r>
       <w:r>
         <w:rPr>
@@ -1653,7 +1653,115 @@
           <w:sz w:val="17"/>
           <w:szCs w:val="17"/>
         </w:rPr>
-        <w:t xml:space="preserve">  ·  LinkedIn Learning  ·  Sept 2026</w:t>
+        <w:t xml:space="preserve">  ·  LinkedIn Learning  ·  Sep 2026</w:t>
+      </w:r>
+    </w:p>
+    <w:p>
+      <w:pPr>
+        <w:spacing w:after="40" w:before="40"/>
+      </w:pPr>
+      <w:r>
+        <w:rPr>
+          <w:rFonts w:ascii="Calibri" w:cs="Calibri" w:eastAsia="Calibri" w:hAnsi="Calibri"/>
+          <w:b/>
+          <w:bCs/>
+          <w:color w:val="1A1A1A"/>
+          <w:sz w:val="18"/>
+          <w:szCs w:val="18"/>
+        </w:rPr>
+        <w:t xml:space="preserve">Build AI Agents with GitHub Copilot by Microsoft Press</w:t>
+      </w:r>
+      <w:r>
+        <w:rPr>
+          <w:rFonts w:ascii="Calibri" w:cs="Calibri" w:eastAsia="Calibri" w:hAnsi="Calibri"/>
+          <w:i/>
+          <w:iCs/>
+          <w:color w:val="6B7280"/>
+          <w:sz w:val="17"/>
+          <w:szCs w:val="17"/>
+        </w:rPr>
+        <w:t xml:space="preserve">  ·  Microsoft  ·  Sep 2026</w:t>
+      </w:r>
+    </w:p>
+    <w:p>
+      <w:pPr>
+        <w:spacing w:after="40" w:before="40"/>
+      </w:pPr>
+      <w:r>
+        <w:rPr>
+          <w:rFonts w:ascii="Calibri" w:cs="Calibri" w:eastAsia="Calibri" w:hAnsi="Calibri"/>
+          <w:b/>
+          <w:bCs/>
+          <w:color w:val="1A1A1A"/>
+          <w:sz w:val="18"/>
+          <w:szCs w:val="18"/>
+        </w:rPr>
+        <w:t xml:space="preserve">Leverage AI in Data Analytics: From Automation to Storytelling</w:t>
+      </w:r>
+      <w:r>
+        <w:rPr>
+          <w:rFonts w:ascii="Calibri" w:cs="Calibri" w:eastAsia="Calibri" w:hAnsi="Calibri"/>
+          <w:i/>
+          <w:iCs/>
+          <w:color w:val="6B7280"/>
+          <w:sz w:val="17"/>
+          <w:szCs w:val="17"/>
+        </w:rPr>
+        <w:t xml:space="preserve">  ·  LinkedIn Learning  ·  Sep 2026</w:t>
+      </w:r>
+    </w:p>
+    <w:p>
+      <w:pPr>
+        <w:spacing w:after="40" w:before="40"/>
+      </w:pPr>
+      <w:r>
+        <w:rPr>
+          <w:rFonts w:ascii="Calibri" w:cs="Calibri" w:eastAsia="Calibri" w:hAnsi="Calibri"/>
+          <w:b/>
+          <w:bCs/>
+          <w:color w:val="1A1A1A"/>
+          <w:sz w:val="18"/>
+          <w:szCs w:val="18"/>
+        </w:rPr>
+        <w:t xml:space="preserve">Learning Data Analytics: Foundations</w:t>
+      </w:r>
+      <w:r>
+        <w:rPr>
+          <w:rFonts w:ascii="Calibri" w:cs="Calibri" w:eastAsia="Calibri" w:hAnsi="Calibri"/>
+          <w:i/>
+          <w:iCs/>
+          <w:color w:val="6B7280"/>
+          <w:sz w:val="17"/>
+          <w:szCs w:val="17"/>
+        </w:rPr>
+        <w:t xml:space="preserve">  ·  LinkedIn Learning  ·  Dec 2024</w:t>
+      </w:r>
+    </w:p>
+    <w:p>
+      <w:pPr>
+        <w:spacing w:after="40" w:before="40"/>
+      </w:pPr>
+      <w:r>
+        <w:rPr>
+          <w:rFonts w:ascii="Calibri" w:cs="Calibri" w:eastAsia="Calibri" w:hAnsi="Calibri"/>
+          <w:b/>
+          <w:bCs/>
+          <w:color w:val="1A1A1A"/>
+          <w:sz w:val="18"/>
+          <w:szCs w:val="18"/>
+        </w:rPr>
+        <w:t xml:space="preserve">Foundations of Digital Consumer Search and Marketing</w:t>
+      </w:r>
+      <w:r>
+        <w:rPr>
+          <w:rFonts w:ascii="Calibri" w:cs="Calibri" w:eastAsia="Calibri" w:hAnsi="Calibri"/>
+          <w:i/>
+          <w:iCs/>
+          <w:color w:val="6B7280"/>
+          <w:sz w:val="17"/>
+          <w:szCs w:val="17"/>
+        </w:rPr>
+        <w:t xml:space="preserve">  ·  Coursera  ·  Aug 2022</w:t>
       </w:r>
     </w:p>
     <w:sectPr>

</xml_diff>